<commit_message>
State the basis for the escape probability in one sentence
The Fig. 1(b) paragraph now says only that a round trip is one encounter with the
extraction structure and that the escape probability there is roughly the inverse square
of the substrate index, about 0.4 for ordinary glass, citing Yablonovitch (1982). That
explains why the panel is drawn at 0.4 without expanding into a derivation.

The fuller account stays in the figure plan: why the one-sided form applies here rather
than Yablonovitch's two-sided one over twice the index squared, and the ergodicity
condition that eq. (2) rests on.

Co-Authored-By: Claude Opus 5 <noreply@anthropic.com>
Claude-Session: https://claude.ai/code/session_01A1WQ3WGcJw8tT3QK2n57xo
</commit_message>
<xml_diff>
--- a/manuscript/unityEQE_v8_ko.docx
+++ b/manuscript/unityEQE_v8_ko.docx
@@ -122,7 +122,7 @@
         <w:rPr>
           <w:rFonts w:hint="eastAsia"/>
         </w:rPr>
-        <w:t xml:space="preserve">외부 광추출 구조가 적용되면 기판까지 전달된 빛이 소자의 적층 구조를 여러 번 왕복하면서 순차적으로 출광되므로, 한 번 왕복할 때의 손실이 최종 출광 효율을 결정한다. 일반적인 OLED에서는 전하수송층으로 사용되는 물질이 가시광선 대역에서 투명하기에, 이 손실은 반사판 역할을 하는 전극에서의 ohmic 손실과 투명 전극에서의 흡수에 의해 주로 결정된다. 그림 1(b)는 왕복 횟수에 따라 기판에 남아 있는 빛이 줄어드는 과정을 보여준다. 여기서 한 번의 왕복은 광추출 구조와의 한 차례 만남에 대응하며, 그때 빛이 빠져나갈 확률을 p로 둔다. 기판 내부에서 각도가 무작위화된 빛에 대해 이 값의 기하광학적 추정치는 T̄/n_sub^2으로 주어지는데, T̄는 탈출원뿔 내에서 평균한 투과율이다[Yablonovitch 1982]. 이에 따르면 n_sub = 1.5에서 p는 0.40, n_sub = 1.8에서 0.27 수준이며, 실제 광추출 구조에서는 곡면이 제공하는 추가적인 각도 변환 때문에 이보다 높아질 수 있다. 또한 식 (2)가 성립하려면 매 왕복에서 각도 무작위화가 일어나야 하는데, 그 조건은 추출 구조 표면의 경사가 ½ arcsin(1/n_sub)를 넘는 것으로 반구형 마이크로렌즈는 이를 충분히 만족한다[Yablonovitch 1982]. 왕복 손실이 큰 소자에서는 남은 빛이 급격히 감쇠하여 몇 차례의 왕복 안에 대부분이 흡수되는 반면, 왕복 손실이 작은 소자에서는 기판에 도달한 빛이 전부 빠져나갈 때까지 완만한 곡선을 그린다. 이 과정을 합산한 결과가 그림 1(c)로, 식 (2)가 주는 추출 효율을 왕복 반사율 R_LED = 1 − A′의 함수로 나타낸 것이다. 여기서 OLED의 한 쪽 전극은 반사형 전극으로 가정하여 T_LED = 0으로 두었다. 그림에서 볼 수 있듯이 소자 내 기생 흡수 손실을 수 % 수준으로 억제하면 곡선이 가파르게 상승하는 영역에 들어가 near-unity 추출이 가능해진다. 또한 같은 왕복 손실이라도 p가 작을수록 손실이 여러 번 누적되므로 곡선은 아래로 이동한다.</w:t>
+        <w:t xml:space="preserve">외부 광추출 구조가 적용되면 기판까지 전달된 빛이 소자의 적층 구조를 여러 번 왕복하면서 순차적으로 출광되므로, 한 번 왕복할 때의 손실이 최종 출광 효율을 결정한다. 일반적인 OLED에서는 전하수송층으로 사용되는 물질이 가시광선 대역에서 투명하기에, 이 손실은 반사판 역할을 하는 전극에서의 ohmic 손실과 투명 전극에서의 흡수에 의해 주로 결정된다. 그림 1(b)는 왕복 횟수에 따라 기판에 남아 있는 빛이 줄어드는 과정을 보여준다. 여기서 한 번의 왕복은 광추출 구조와의 한 차례 만남에 대응하며, 그때의 탈출 확률 p는 기판 내부에서 각도가 무작위화된 빛에 대해 대략 1/n_sub^2으로, 통상적인 유리 기판(n_sub = 1.5)에서 0.4 수준이다[Yablonovitch 1982]. 왕복 손실이 큰 소자에서는 남은 빛이 급격히 감쇠하여 몇 차례의 왕복 안에 대부분이 흡수되는 반면, 왕복 손실이 작은 소자에서는 기판에 도달한 빛이 전부 빠져나갈 때까지 완만한 곡선을 그린다. 이 과정을 합산한 결과가 그림 1(c)로, 식 (2)가 주는 추출 효율을 왕복 반사율 R_LED = 1 − A′의 함수로 나타낸 것이다. 여기서 OLED의 한 쪽 전극은 반사형 전극으로 가정하여 T_LED = 0으로 두었다. 그림에서 볼 수 있듯이 소자 내 기생 흡수 손실을 수 % 수준으로 억제하면 곡선이 가파르게 상승하는 영역에 들어가 near-unity 추출이 가능해진다. 또한 같은 왕복 손실이라도 p가 작을수록 손실이 여러 번 누적되므로 곡선은 아래로 이동한다.</w:t>
       </w:r>
     </w:p>
     <w:p>
@@ -146,7 +146,7 @@
         <w:rPr>
           <w:rFonts w:hint="eastAsia"/>
         </w:rPr>
-        <w:t xml:space="preserve">이처럼 외부 광추출 구조가 도입된 OLED에서는 소자 내부의 흡수 경로가 최종 효율에 큰 영향을 미친다. 이 흡수는 기존 OLED 설계에서는 5% 정도의 손실에 그쳐 비교적 부차적인 손실 경로로 간주되었지만, 이 경우에는 기판까지 전달되는 빛의 양을 줄일 뿐 아니라 식 (2)에서 보듯 출광 효율에도 직접적으로 영향을 미친다. 예를 들어 green OLED에서 ITO의 두께로 70 nm나 150 nm가 선호되어 온 것은, 해당 파장에서 λ/4 또는 λ/2의 cavity 조건을 만족시켜 얻는 출광 효율의 이득이 두꺼운 ITO에서 발생하는 흡수 손실보다 컸기 때문이다. 그림 2(a)는 ITO 두께에 따른 왕복 손실을 거울의 ohmic 손실과 TCO 흡수로 나누고, 그에 따른 추출 효율을 Al과 Ag 반사판에 대해 비교한 것이다. ITO가 두꺼워질수록 TCO 흡수는 두께에 비례하여 커지는 반면 거울의 ohmic 손실은 일정하므로, 통상적인 Al 반사판에서는 TCO 흡수가 거울 손실과 맞먹는 수준까지 커지고 저손실 Ag 반사판에서는 사실상 유일한 손실 경로가 된다. 그 결과 추출 효율은 Al에서도 뚜렷하게, Ag에서는 더 가파르게 감소한다. 이러한 경향은 η_sub를 높이기 위해 고굴절 기판과 광추출 구조를 활용할 때 더욱 크게 드러난다(그림 2(b)). 그림 2(b)에는 본 연구의 광추출 구조에 대해 광선추적으로 계산한 p도 함께 나타내었으며, 앞서 기하광학적으로 추정한 값과 잘 일치한다. 고굴절 광추출 구조를 사용하면 기판과 공기 사이의 굴절률 차이가 커져 critical angle이 작아지고, 한 번에 출광되는 빛의 양이 줄어 빛이 더 여러 번 왕복해야 하기 때문이다(Supplementary Fig. 3: 광추출 층의 굴절률에 따른 BSDF_T, BSDF_R 특성). 그림 2(b)에서 보듯 고굴절 광추출 구조를 쓰면 기판에 전달되는 빛은 많아지지만 extraction efficiency는 감소하며, 기생 흡수가 큰 소자일수록 이 감소폭이 기판 전달 모드의 향상을 능가하여 최종 외부 양자효율의 증가가 제한된다.</w:t>
+        <w:t xml:space="preserve">이처럼 외부 광추출 구조가 도입된 OLED에서는 소자 내부의 흡수 경로가 최종 효율에 큰 영향을 미친다. 이 흡수는 기존 OLED 설계에서는 5% 정도의 손실에 그쳐 비교적 부차적인 손실 경로로 간주되었지만, 이 경우에는 기판까지 전달되는 빛의 양을 줄일 뿐 아니라 식 (2)에서 보듯 출광 효율에도 직접적으로 영향을 미친다. 예를 들어 green OLED에서 ITO의 두께로 70 nm나 150 nm가 선호되어 온 것은, 해당 파장에서 λ/4 또는 λ/2의 cavity 조건을 만족시켜 얻는 출광 효율의 이득이 두꺼운 ITO에서 발생하는 흡수 손실보다 컸기 때문이다. 그림 2(a)는 ITO 두께에 따른 왕복 손실을 거울의 ohmic 손실과 TCO 흡수로 나누고, 그에 따른 추출 효율을 Al과 Ag 반사판에 대해 비교한 것이다. ITO가 두꺼워질수록 TCO 흡수는 두께에 비례하여 커지는 반면 거울의 ohmic 손실은 일정하므로, 통상적인 Al 반사판에서는 TCO 흡수가 거울 손실과 맞먹는 수준까지 커지고 저손실 Ag 반사판에서는 사실상 유일한 손실 경로가 된다. 그 결과 추출 효율은 Al에서도 뚜렷하게, Ag에서는 더 가파르게 감소한다. 이러한 경향은 η_sub를 높이기 위해 고굴절 기판과 광추출 구조를 활용할 때 더욱 크게 드러난다(그림 2(b)). 고굴절 광추출 구조를 사용하면 기판과 공기 사이의 굴절률 차이가 커져 critical angle이 작아지고, 한 번에 출광되는 빛의 양이 줄어 빛이 더 여러 번 왕복해야 하기 때문이다(Supplementary Fig. 3: 광추출 층의 굴절률에 따른 BSDF_T, BSDF_R 특성). 그림 2(b)에서 보듯 고굴절 광추출 구조를 쓰면 기판에 전달되는 빛은 많아지지만 extraction efficiency는 감소하며, 기생 흡수가 큰 소자일수록 이 감소폭이 기판 전달 모드의 향상을 능가하여 최종 외부 양자효율의 증가가 제한된다.</w:t>
       </w:r>
     </w:p>
     <w:p>

</xml_diff>